<commit_message>
minor changes to script
</commit_message>
<xml_diff>
--- a/midterm_presentation/presentation_script.docx
+++ b/midterm_presentation/presentation_script.docx
@@ -71,7 +71,7 @@
           <w:sz w:val="22"/>
           <w:szCs w:val="22"/>
         </w:rPr>
-        <w:t xml:space="preserve">  17 slides (slide 14 cut)</w:t>
+        <w:t xml:space="preserve">  17 slides</w:t>
       </w:r>
     </w:p>
     <w:p>
@@ -115,7 +115,23 @@
           <w:sz w:val="22"/>
           <w:szCs w:val="22"/>
         </w:rPr>
-        <w:t xml:space="preserve">"Good [morning/afternoon]. My name is Adam </w:t>
+        <w:t>"Good</w:t>
+      </w:r>
+      <w:r>
+        <w:rPr>
+          <w:rFonts w:ascii="Arial" w:eastAsia="Arial" w:hAnsi="Arial" w:cs="Arial"/>
+          <w:sz w:val="22"/>
+          <w:szCs w:val="22"/>
+        </w:rPr>
+        <w:t xml:space="preserve"> </w:t>
+      </w:r>
+      <w:r>
+        <w:rPr>
+          <w:rFonts w:ascii="Arial" w:eastAsia="Arial" w:hAnsi="Arial" w:cs="Arial"/>
+          <w:sz w:val="22"/>
+          <w:szCs w:val="22"/>
+        </w:rPr>
+        <w:t xml:space="preserve">afternoon. My name is Adam </w:t>
       </w:r>
       <w:r>
         <w:rPr>
@@ -1023,7 +1039,7 @@
           <w:sz w:val="22"/>
           <w:szCs w:val="22"/>
         </w:rPr>
-        <w:t xml:space="preserve">"I want to be honest about the theory here because it's genuinely subtle. The original Adam paper claimed convergence guarantees, but Reddi et al. in 2018 showed a counterexample — a simple convex problem where Adam </w:t>
+        <w:t xml:space="preserve">"I want to be honest about the theory here because it's subtle. The original Adam paper claimed convergence guarantees, but Reddi et al. in 2018 showed a counterexample — a simple convex problem where Adam </w:t>
       </w:r>
       <w:proofErr w:type="gramStart"/>
       <w:r>
@@ -1041,7 +1057,7 @@
           <w:sz w:val="22"/>
           <w:szCs w:val="22"/>
         </w:rPr>
-        <w:t xml:space="preserve">. The issue is that the adaptive step sizes can prevent the algorithm from accumulating enough gradient information to </w:t>
+        <w:t xml:space="preserve">. The issue is that the adaptive step sizes can prevent the algorithm from accumulating enough gradient information to converge </w:t>
       </w:r>
       <w:r>
         <w:rPr>
@@ -1050,7 +1066,7 @@
           <w:szCs w:val="22"/>
         </w:rPr>
         <w:lastRenderedPageBreak/>
-        <w:t xml:space="preserve">converge in the worst case. </w:t>
+        <w:t xml:space="preserve">in the worst case. </w:t>
       </w:r>
       <w:proofErr w:type="spellStart"/>
       <w:r>
@@ -1424,25 +1440,15 @@
           <w:sz w:val="22"/>
           <w:szCs w:val="22"/>
         </w:rPr>
-        <w:t xml:space="preserve">"To summarize: Adam is best understood as an online method of moments estimator that standardizes gradient updates coordinate-wise. It combines momentum for noise reduction with adaptive scaling for handling heterogeneous loss landscapes. It's not a black box optimizer — it has a clean statistical interpretation and well-understood failure modes. Thank you. Happy to </w:t>
-      </w:r>
-      <w:proofErr w:type="gramStart"/>
-      <w:r>
-        <w:rPr>
-          <w:rFonts w:ascii="Arial" w:eastAsia="Arial" w:hAnsi="Arial" w:cs="Arial"/>
-          <w:sz w:val="22"/>
-          <w:szCs w:val="22"/>
-        </w:rPr>
-        <w:t>take</w:t>
-      </w:r>
-      <w:proofErr w:type="gramEnd"/>
-      <w:r>
-        <w:rPr>
-          <w:rFonts w:ascii="Arial" w:eastAsia="Arial" w:hAnsi="Arial" w:cs="Arial"/>
-          <w:sz w:val="22"/>
-          <w:szCs w:val="22"/>
-        </w:rPr>
-        <w:t xml:space="preserve"> questions."</w:t>
+        <w:t>"To summarize: Adam is best understood as an online method of moments estimator that standardizes gradient updates coordinate-wise. It combines momentum for noise reduction with adaptive scaling for handling heterogeneous loss landscapes. It's not a black box optimizer — it has a clean statistical interpretation and well-understood failure modes. Thank you</w:t>
+      </w:r>
+      <w:r>
+        <w:rPr>
+          <w:rFonts w:ascii="Arial" w:eastAsia="Arial" w:hAnsi="Arial" w:cs="Arial"/>
+          <w:sz w:val="22"/>
+          <w:szCs w:val="22"/>
+        </w:rPr>
+        <w:t>.”</w:t>
       </w:r>
     </w:p>
     <w:p>

</xml_diff>